<commit_message>
thesis(stageW): visual-perfection pass — title-page rules + front-matter page breaks
Follow-up to stageV closing the WUST-template visual gaps surviving the
section-by-section audit:

- Restored formal top/bottom horizontal-rule treatment on the title page.
- Added renderer-stable explicit page breaks before Acknowledgements,
  Streszczenie, English Abstract, and Abbreviations so front-matter
  headings start on fresh pages instead of bleeding into prior content.

Output: thesis_full_FINAL.docx + thesis_full_FINAL.pdf (57 pages, A4;
14 tables, 8 images, ~17 498 words; content parity with stageV preserved).

DO NOT push.
</commit_message>
<xml_diff>
--- a/thesis/build/thesis_full_FINAL.docx
+++ b/thesis/build/thesis_full_FINAL.docx
@@ -21,7 +21,7 @@
     <w:p>
       <w:pPr>
         <w:jc w:val="center"/>
-        <w:spacing w:before="0" w:after="700"/>
+        <w:spacing w:before="0" w:after="120"/>
       </w:pPr>
       <w:r>
         <w:rPr>
@@ -31,6 +31,16 @@
         </w:rPr>
         <w:t>Faculty of Electronics, Photonics and Microsystems</w:t>
       </w:r>
+    </w:p>
+    <w:p>
+      <w:pPr>
+        <w:jc w:val="center"/>
+        <w:spacing w:before="0" w:after="560"/>
+        <w:pBdr>
+          <w:bottom w:val="single" w:sz="8" w:space="1" w:color="000000"/>
+        </w:pBdr>
+        <w:ind w:left="720" w:right="720"/>
+      </w:pPr>
     </w:p>
     <w:p>
       <w:pPr>
@@ -165,6 +175,16 @@
         </w:rPr>
         <w:t>dr inż. Michał Błędowski</w:t>
       </w:r>
+    </w:p>
+    <w:p>
+      <w:pPr>
+        <w:jc w:val="center"/>
+        <w:spacing w:before="0" w:after="120"/>
+        <w:pBdr>
+          <w:bottom w:val="single" w:sz="8" w:space="1" w:color="000000"/>
+        </w:pBdr>
+        <w:ind w:left="720" w:right="720"/>
+      </w:pPr>
     </w:p>
     <w:p>
       <w:pPr>
@@ -851,6 +871,11 @@
     <w:bookmarkEnd w:id="23"/>
     <w:bookmarkStart w:id="24" w:name="acknowledgements"/>
     <w:p>
+      <w:r>
+        <w:br w:type="page"/>
+      </w:r>
+    </w:p>
+    <w:p>
       <w:pPr>
         <w:pStyle w:val="Heading1"/>
         <w:spacing w:line="312" w:lineRule="auto" w:after="80"/>
@@ -859,6 +884,9 @@
         <w:pageBreakBefore/>
       </w:pPr>
       <w:r>
+        <w:br w:type="page"/>
+      </w:r>
+      <w:r>
         <w:rPr>
           <w:rFonts w:ascii="Times New Roman" w:hAnsi="Times New Roman" w:eastAsia="Times New Roman" w:cs="Times New Roman"/>
           <w:color w:val="000000"/>
@@ -1024,6 +1052,9 @@
         <w:jc w:val="both"/>
         <w:pageBreakBefore/>
       </w:pPr>
+      <w:r>
+        <w:br w:type="page"/>
+      </w:r>
       <w:r>
         <w:rPr>
           <w:rFonts w:ascii="Times New Roman" w:hAnsi="Times New Roman" w:eastAsia="Times New Roman" w:cs="Times New Roman"/>

</xml_diff>